<commit_message>
Replace repository contents with complete local SEC project
</commit_message>
<xml_diff>
--- a/모바일웹서비스 프로젝트 공통평가 01_수행 결과 보고서.docx
+++ b/모바일웹서비스 프로젝트 공통평가 01_수행 결과 보고서.docx
@@ -930,7 +930,17 @@
           </w:tcPr>
           <w:p>
             <w:r>
-              <w:t>[실행 후 체크]</w:t>
+              <w:t>[</w:t>
+            </w:r>
+            <w:r>
+              <w:rPr>
+                <w:rFonts w:hint="eastAsia" w:eastAsia="宋体"/>
+                <w:lang w:eastAsia="zh-CN"/>
+              </w:rPr>
+              <w:t>○</w:t>
+            </w:r>
+            <w:r>
+              <w:t>]</w:t>
             </w:r>
           </w:p>
         </w:tc>
@@ -941,7 +951,17 @@
           </w:tcPr>
           <w:p>
             <w:r>
-              <w:t>[판정 후 기입]</w:t>
+              <w:t>[</w:t>
+            </w:r>
+            <w:r>
+              <w:rPr>
+                <w:rFonts w:hint="eastAsia" w:eastAsia="宋体"/>
+                <w:lang w:eastAsia="zh-CN"/>
+              </w:rPr>
+              <w:t>○</w:t>
+            </w:r>
+            <w:r>
+              <w:t>]</w:t>
             </w:r>
           </w:p>
         </w:tc>
@@ -1143,7 +1163,17 @@
           </w:tcPr>
           <w:p>
             <w:r>
-              <w:t>[실행 후 체크]</w:t>
+              <w:t>[</w:t>
+            </w:r>
+            <w:r>
+              <w:rPr>
+                <w:rFonts w:hint="eastAsia" w:eastAsia="宋体"/>
+                <w:lang w:eastAsia="zh-CN"/>
+              </w:rPr>
+              <w:t>○</w:t>
+            </w:r>
+            <w:r>
+              <w:t>]</w:t>
             </w:r>
           </w:p>
         </w:tc>
@@ -1154,7 +1184,17 @@
           </w:tcPr>
           <w:p>
             <w:r>
-              <w:t>[판정 후 기입]</w:t>
+              <w:t>[</w:t>
+            </w:r>
+            <w:r>
+              <w:rPr>
+                <w:rFonts w:hint="eastAsia" w:eastAsia="宋体"/>
+                <w:lang w:eastAsia="zh-CN"/>
+              </w:rPr>
+              <w:t>○</w:t>
+            </w:r>
+            <w:r>
+              <w:t>]</w:t>
             </w:r>
           </w:p>
         </w:tc>
@@ -1164,6 +1204,19 @@
             <w:vAlign w:val="center"/>
           </w:tcPr>
           <w:p>
+            <w:r>
+              <w:pict>
+                <v:shape id="_x0000_i1026" o:spt="75" alt="github_repository" type="#_x0000_t75" style="height:50.5pt;width:105.55pt;" filled="f" o:preferrelative="t" stroked="f" coordsize="21600,21600">
+                  <v:path/>
+                  <v:fill on="f" focussize="0,0"/>
+                  <v:stroke on="f"/>
+                  <v:imagedata r:id="rId8" o:title="github_repository"/>
+                  <o:lock v:ext="edit" aspectratio="t"/>
+                  <w10:wrap type="none"/>
+                  <w10:anchorlock/>
+                </v:shape>
+              </w:pict>
+            </w:r>
             <w:r>
               <w:t>GitHub: https://github.com/ansf0731-sys/PhotoBlog</w:t>
             </w:r>
@@ -1435,7 +1488,17 @@
           </w:tcPr>
           <w:p>
             <w:r>
-              <w:t>[실행 후 체크]</w:t>
+              <w:t>[</w:t>
+            </w:r>
+            <w:r>
+              <w:rPr>
+                <w:rFonts w:hint="eastAsia" w:eastAsia="宋体"/>
+                <w:lang w:eastAsia="zh-CN"/>
+              </w:rPr>
+              <w:t>○</w:t>
+            </w:r>
+            <w:r>
+              <w:t>]</w:t>
             </w:r>
           </w:p>
         </w:tc>
@@ -1446,7 +1509,17 @@
           </w:tcPr>
           <w:p>
             <w:r>
-              <w:t>[판정 후 기입]</w:t>
+              <w:t>[</w:t>
+            </w:r>
+            <w:r>
+              <w:rPr>
+                <w:rFonts w:hint="eastAsia" w:eastAsia="宋体"/>
+                <w:lang w:eastAsia="zh-CN"/>
+              </w:rPr>
+              <w:t>○</w:t>
+            </w:r>
+            <w:r>
+              <w:t>]</w:t>
             </w:r>
           </w:p>
         </w:tc>
@@ -1457,10 +1530,31 @@
           </w:tcPr>
           <w:p>
             <w:r>
-              <w:t>캡처 삽입: 웹 게시물 작성 화면 및 게시 완료 화면(URL 주소창 포함)</w:t>
+              <w:pict>
+                <v:shape id="_x0000_i1027" o:spt="75" alt="post_create" type="#_x0000_t75" style="height:50.3pt;width:105.8pt;" filled="f" o:preferrelative="t" stroked="f" coordsize="21600,21600">
+                  <v:path/>
+                  <v:fill on="f" focussize="0,0"/>
+                  <v:stroke on="f"/>
+                  <v:imagedata r:id="rId9" o:title="post_create"/>
+                  <o:lock v:ext="edit" aspectratio="t"/>
+                  <w10:wrap type="none"/>
+                  <w10:anchorlock/>
+                </v:shape>
+              </w:pict>
             </w:r>
-            <w:bookmarkStart w:id="0" w:name="_GoBack"/>
-            <w:bookmarkEnd w:id="0"/>
+            <w:r>
+              <w:pict>
+                <v:shape id="_x0000_i1028" o:spt="75" alt="post_published" type="#_x0000_t75" style="height:57.35pt;width:105.55pt;" filled="f" o:preferrelative="t" stroked="f" coordsize="21600,21600">
+                  <v:path/>
+                  <v:fill on="f" focussize="0,0"/>
+                  <v:stroke on="f"/>
+                  <v:imagedata r:id="rId10" o:title="post_published"/>
+                  <o:lock v:ext="edit" aspectratio="t"/>
+                  <w10:wrap type="none"/>
+                  <w10:anchorlock/>
+                </v:shape>
+              </w:pict>
+            </w:r>
           </w:p>
         </w:tc>
       </w:tr>
@@ -1632,7 +1726,17 @@
           </w:tcPr>
           <w:p>
             <w:r>
-              <w:t>[실행 후 체크]</w:t>
+              <w:t>[</w:t>
+            </w:r>
+            <w:r>
+              <w:rPr>
+                <w:rFonts w:hint="eastAsia" w:eastAsia="宋体"/>
+                <w:lang w:eastAsia="zh-CN"/>
+              </w:rPr>
+              <w:t>○</w:t>
+            </w:r>
+            <w:r>
+              <w:t>]</w:t>
             </w:r>
           </w:p>
         </w:tc>
@@ -1643,7 +1747,17 @@
           </w:tcPr>
           <w:p>
             <w:r>
-              <w:t>[판정 후 기입]</w:t>
+              <w:t>[</w:t>
+            </w:r>
+            <w:r>
+              <w:rPr>
+                <w:rFonts w:hint="eastAsia" w:eastAsia="宋体"/>
+                <w:lang w:eastAsia="zh-CN"/>
+              </w:rPr>
+              <w:t>○</w:t>
+            </w:r>
+            <w:r>
+              <w:t>]</w:t>
             </w:r>
           </w:p>
         </w:tc>
@@ -1653,8 +1767,43 @@
             <w:vAlign w:val="center"/>
           </w:tcPr>
           <w:p>
+            <w:pPr>
+              <w:rPr>
+                <w:rFonts w:hint="eastAsia" w:eastAsia="宋体"/>
+                <w:lang w:eastAsia="zh-CN"/>
+              </w:rPr>
+            </w:pPr>
             <w:r>
-              <w:t>캡처 삽입: 터미널에서 GET /api_root/Post/ 요청 및 응답</w:t>
+              <w:rPr>
+                <w:rFonts w:hint="eastAsia" w:eastAsia="宋体"/>
+                <w:lang w:eastAsia="zh-CN"/>
+              </w:rPr>
+              <w:pict>
+                <v:shape id="_x0000_i1029" o:spt="75" alt="api_posts" type="#_x0000_t75" style="height:45.9pt;width:105.75pt;" filled="f" o:preferrelative="t" stroked="f" coordsize="21600,21600">
+                  <v:path/>
+                  <v:fill on="f" focussize="0,0"/>
+                  <v:stroke on="f"/>
+                  <v:imagedata r:id="rId11" o:title="api_posts"/>
+                  <o:lock v:ext="edit" aspectratio="t"/>
+                  <w10:wrap type="none"/>
+                  <w10:anchorlock/>
+                </v:shape>
+              </w:pict>
+            </w:r>
+          </w:p>
+          <w:p>
+            <w:r>
+              <w:pict>
+                <v:shape id="_x0000_i1030" o:spt="75" alt="terminal_get" type="#_x0000_t75" style="height:59.55pt;width:105.85pt;" filled="f" o:preferrelative="t" stroked="f" coordsize="21600,21600">
+                  <v:path/>
+                  <v:fill on="f" focussize="0,0"/>
+                  <v:stroke on="f"/>
+                  <v:imagedata r:id="rId12" o:title="terminal_get"/>
+                  <o:lock v:ext="edit" aspectratio="t"/>
+                  <w10:wrap type="none"/>
+                  <w10:anchorlock/>
+                </v:shape>
+              </w:pict>
             </w:r>
           </w:p>
         </w:tc>
@@ -1860,7 +2009,17 @@
           </w:tcPr>
           <w:p>
             <w:r>
-              <w:t>[실행 후 체크]</w:t>
+              <w:t>[</w:t>
+            </w:r>
+            <w:r>
+              <w:rPr>
+                <w:rFonts w:hint="eastAsia" w:eastAsia="宋体"/>
+                <w:lang w:eastAsia="zh-CN"/>
+              </w:rPr>
+              <w:t>○</w:t>
+            </w:r>
+            <w:r>
+              <w:t>]</w:t>
             </w:r>
           </w:p>
         </w:tc>
@@ -1871,7 +2030,17 @@
           </w:tcPr>
           <w:p>
             <w:r>
-              <w:t>[판정 후 기입]</w:t>
+              <w:t>[</w:t>
+            </w:r>
+            <w:r>
+              <w:rPr>
+                <w:rFonts w:hint="eastAsia" w:eastAsia="宋体"/>
+                <w:lang w:eastAsia="zh-CN"/>
+              </w:rPr>
+              <w:t>○</w:t>
+            </w:r>
+            <w:r>
+              <w:t>]</w:t>
             </w:r>
           </w:p>
         </w:tc>
@@ -1882,7 +2051,17 @@
           </w:tcPr>
           <w:p>
             <w:r>
-              <w:t>캡처 삽입: JSON Beautifier에서 API 응답 검증 화면</w:t>
+              <w:pict>
+                <v:shape id="_x0000_i1031" o:spt="75" alt="json_validation" type="#_x0000_t75" style="height:41.55pt;width:105.8pt;" filled="f" o:preferrelative="t" stroked="f" coordsize="21600,21600">
+                  <v:path/>
+                  <v:fill on="f" focussize="0,0"/>
+                  <v:stroke on="f"/>
+                  <v:imagedata r:id="rId13" o:title="json_validation"/>
+                  <o:lock v:ext="edit" aspectratio="t"/>
+                  <w10:wrap type="none"/>
+                  <w10:anchorlock/>
+                </v:shape>
+              </w:pict>
             </w:r>
           </w:p>
         </w:tc>
@@ -2118,7 +2297,17 @@
           </w:tcPr>
           <w:p>
             <w:r>
-              <w:t>[실행 후 체크]</w:t>
+              <w:t>[</w:t>
+            </w:r>
+            <w:r>
+              <w:rPr>
+                <w:rFonts w:hint="eastAsia" w:eastAsia="宋体"/>
+                <w:lang w:eastAsia="zh-CN"/>
+              </w:rPr>
+              <w:t>○</w:t>
+            </w:r>
+            <w:r>
+              <w:t>]</w:t>
             </w:r>
           </w:p>
         </w:tc>
@@ -2129,7 +2318,17 @@
           </w:tcPr>
           <w:p>
             <w:r>
-              <w:t>[판정 후 기입]</w:t>
+              <w:t>[</w:t>
+            </w:r>
+            <w:r>
+              <w:rPr>
+                <w:rFonts w:hint="eastAsia" w:eastAsia="宋体"/>
+                <w:lang w:eastAsia="zh-CN"/>
+              </w:rPr>
+              <w:t>○</w:t>
+            </w:r>
+            <w:r>
+              <w:t>]</w:t>
             </w:r>
           </w:p>
         </w:tc>
@@ -2140,7 +2339,17 @@
           </w:tcPr>
           <w:p>
             <w:r>
-              <w:t>캡처 삽입: coverage HTML 리포트 화면</w:t>
+              <w:pict>
+                <v:shape id="_x0000_i1032" o:spt="75" alt="test_coverage" type="#_x0000_t75" style="height:45.05pt;width:105.1pt;" filled="f" o:preferrelative="t" stroked="f" coordsize="21600,21600">
+                  <v:path/>
+                  <v:fill on="f" focussize="0,0"/>
+                  <v:stroke on="f"/>
+                  <v:imagedata r:id="rId14" o:title="test_coverage"/>
+                  <o:lock v:ext="edit" aspectratio="t"/>
+                  <w10:wrap type="none"/>
+                  <w10:anchorlock/>
+                </v:shape>
+              </w:pict>
             </w:r>
           </w:p>
         </w:tc>
@@ -2348,7 +2557,17 @@
           </w:tcPr>
           <w:p>
             <w:r>
-              <w:t>[실행 후 체크]</w:t>
+              <w:t>[</w:t>
+            </w:r>
+            <w:r>
+              <w:rPr>
+                <w:rFonts w:hint="eastAsia" w:eastAsia="宋体"/>
+                <w:lang w:eastAsia="zh-CN"/>
+              </w:rPr>
+              <w:t>○</w:t>
+            </w:r>
+            <w:r>
+              <w:t>]</w:t>
             </w:r>
           </w:p>
         </w:tc>
@@ -2359,7 +2578,17 @@
           </w:tcPr>
           <w:p>
             <w:r>
-              <w:t>[판정 후 기입]</w:t>
+              <w:t>[</w:t>
+            </w:r>
+            <w:r>
+              <w:rPr>
+                <w:rFonts w:hint="eastAsia" w:eastAsia="宋体"/>
+                <w:lang w:eastAsia="zh-CN"/>
+              </w:rPr>
+              <w:t>○</w:t>
+            </w:r>
+            <w:r>
+              <w:t>]</w:t>
             </w:r>
           </w:p>
         </w:tc>
@@ -2369,8 +2598,45 @@
             <w:vAlign w:val="center"/>
           </w:tcPr>
           <w:p>
+            <w:pPr>
+              <w:rPr>
+                <w:rFonts w:hint="eastAsia" w:eastAsia="宋体"/>
+                <w:lang w:eastAsia="zh-CN"/>
+              </w:rPr>
+            </w:pPr>
             <w:r>
-              <w:t>캡처 삽입: Socket/HTTP 요청 메시지 확인 화면 또는 요청 로그</w:t>
+              <w:rPr>
+                <w:rFonts w:hint="eastAsia" w:eastAsia="宋体"/>
+                <w:lang w:eastAsia="zh-CN"/>
+              </w:rPr>
+              <w:pict>
+                <v:shape id="_x0000_i1033" o:spt="75" alt="http_request_log" type="#_x0000_t75" style="height:58.1pt;width:105.4pt;" filled="f" o:preferrelative="t" stroked="f" coordsize="21600,21600">
+                  <v:path/>
+                  <v:fill on="f" focussize="0,0"/>
+                  <v:stroke on="f"/>
+                  <v:imagedata r:id="rId15" o:title="http_request_log"/>
+                  <o:lock v:ext="edit" aspectratio="t"/>
+                  <w10:wrap type="none"/>
+                  <w10:anchorlock/>
+                </v:shape>
+              </w:pict>
+            </w:r>
+            <w:r>
+              <w:rPr>
+                <w:rFonts w:hint="eastAsia" w:eastAsia="宋体"/>
+                <w:lang w:eastAsia="zh-CN"/>
+              </w:rPr>
+              <w:pict>
+                <v:shape id="_x0000_i1034" o:spt="75" alt="socket_server_request" type="#_x0000_t75" style="height:70.45pt;width:105.8pt;" filled="f" o:preferrelative="t" stroked="f" coordsize="21600,21600">
+                  <v:path/>
+                  <v:fill on="f" focussize="0,0"/>
+                  <v:stroke on="f"/>
+                  <v:imagedata r:id="rId16" o:title="socket_server_request"/>
+                  <o:lock v:ext="edit" aspectratio="t"/>
+                  <w10:wrap type="none"/>
+                  <w10:anchorlock/>
+                </v:shape>
+              </w:pict>
             </w:r>
           </w:p>
         </w:tc>
@@ -2556,7 +2822,17 @@
           </w:tcPr>
           <w:p>
             <w:r>
-              <w:t>[실행 후 체크]</w:t>
+              <w:t>[</w:t>
+            </w:r>
+            <w:r>
+              <w:rPr>
+                <w:rFonts w:hint="eastAsia" w:eastAsia="宋体"/>
+                <w:lang w:eastAsia="zh-CN"/>
+              </w:rPr>
+              <w:t>○</w:t>
+            </w:r>
+            <w:r>
+              <w:t>]</w:t>
             </w:r>
           </w:p>
         </w:tc>
@@ -2567,7 +2843,17 @@
           </w:tcPr>
           <w:p>
             <w:r>
-              <w:t>[판정 후 기입]</w:t>
+              <w:t>[</w:t>
+            </w:r>
+            <w:r>
+              <w:rPr>
+                <w:rFonts w:hint="eastAsia" w:eastAsia="宋体"/>
+                <w:lang w:eastAsia="zh-CN"/>
+              </w:rPr>
+              <w:t>○</w:t>
+            </w:r>
+            <w:r>
+              <w:t>]</w:t>
             </w:r>
           </w:p>
         </w:tc>
@@ -2577,8 +2863,45 @@
             <w:vAlign w:val="center"/>
           </w:tcPr>
           <w:p>
+            <w:pPr>
+              <w:rPr>
+                <w:rFonts w:hint="eastAsia" w:eastAsia="宋体"/>
+                <w:lang w:eastAsia="zh-CN"/>
+              </w:rPr>
+            </w:pPr>
             <w:r>
-              <w:t>캡처 삽입: localhost 서버 브라우저 출력 화면</w:t>
+              <w:rPr>
+                <w:rFonts w:hint="eastAsia" w:eastAsia="宋体"/>
+                <w:lang w:eastAsia="zh-CN"/>
+              </w:rPr>
+              <w:pict>
+                <v:shape id="_x0000_i1035" o:spt="75" alt="localhost_api_posts" type="#_x0000_t75" style="height:89.05pt;width:105.4pt;" filled="f" o:preferrelative="t" stroked="f" coordsize="21600,21600">
+                  <v:path/>
+                  <v:fill on="f" focussize="0,0"/>
+                  <v:stroke on="f"/>
+                  <v:imagedata r:id="rId17" o:title="localhost_api_posts"/>
+                  <o:lock v:ext="edit" aspectratio="t"/>
+                  <w10:wrap type="none"/>
+                  <w10:anchorlock/>
+                </v:shape>
+              </w:pict>
+            </w:r>
+            <w:r>
+              <w:rPr>
+                <w:rFonts w:hint="eastAsia" w:eastAsia="宋体"/>
+                <w:lang w:eastAsia="zh-CN"/>
+              </w:rPr>
+              <w:pict>
+                <v:shape id="_x0000_i1036" o:spt="75" alt="localhost_server" type="#_x0000_t75" style="height:64.75pt;width:105.75pt;" filled="f" o:preferrelative="t" stroked="f" coordsize="21600,21600">
+                  <v:path/>
+                  <v:fill on="f" focussize="0,0"/>
+                  <v:stroke on="f"/>
+                  <v:imagedata r:id="rId18" o:title="localhost_server"/>
+                  <o:lock v:ext="edit" aspectratio="t"/>
+                  <w10:wrap type="none"/>
+                  <w10:anchorlock/>
+                </v:shape>
+              </w:pict>
             </w:r>
           </w:p>
         </w:tc>
@@ -2749,7 +3072,17 @@
           </w:tcPr>
           <w:p>
             <w:r>
-              <w:t>[실행 후 체크]</w:t>
+              <w:t>[</w:t>
+            </w:r>
+            <w:r>
+              <w:rPr>
+                <w:rFonts w:hint="eastAsia" w:eastAsia="宋体"/>
+                <w:lang w:eastAsia="zh-CN"/>
+              </w:rPr>
+              <w:t>○</w:t>
+            </w:r>
+            <w:r>
+              <w:t>]</w:t>
             </w:r>
           </w:p>
         </w:tc>
@@ -2760,7 +3093,17 @@
           </w:tcPr>
           <w:p>
             <w:r>
-              <w:t>[판정 후 기입]</w:t>
+              <w:t>[</w:t>
+            </w:r>
+            <w:r>
+              <w:rPr>
+                <w:rFonts w:hint="eastAsia" w:eastAsia="宋体"/>
+                <w:lang w:eastAsia="zh-CN"/>
+              </w:rPr>
+              <w:t>○</w:t>
+            </w:r>
+            <w:r>
+              <w:t>]</w:t>
             </w:r>
           </w:p>
         </w:tc>
@@ -2770,8 +3113,28 @@
             <w:vAlign w:val="center"/>
           </w:tcPr>
           <w:p>
+            <w:pPr>
+              <w:rPr>
+                <w:rFonts w:hint="eastAsia" w:eastAsia="宋体"/>
+                <w:lang w:eastAsia="zh-CN"/>
+              </w:rPr>
+            </w:pPr>
             <w:r>
-              <w:t>캡처 삽입: Android 앱 시작 화면</w:t>
+              <w:rPr>
+                <w:rFonts w:hint="eastAsia" w:eastAsia="宋体"/>
+                <w:lang w:eastAsia="zh-CN"/>
+              </w:rPr>
+              <w:pict>
+                <v:shape id="_x0000_i1037" o:spt="75" alt="android_start" type="#_x0000_t75" style="height:128.1pt;width:105.4pt;" filled="f" o:preferrelative="t" stroked="f" coordsize="21600,21600">
+                  <v:path/>
+                  <v:fill on="f" focussize="0,0"/>
+                  <v:stroke on="f"/>
+                  <v:imagedata r:id="rId19" o:title="android_start"/>
+                  <o:lock v:ext="edit" aspectratio="t"/>
+                  <w10:wrap type="none"/>
+                  <w10:anchorlock/>
+                </v:shape>
+              </w:pict>
             </w:r>
           </w:p>
         </w:tc>
@@ -2957,7 +3320,17 @@
           </w:tcPr>
           <w:p>
             <w:r>
-              <w:t>[실행 후 체크]</w:t>
+              <w:t>[</w:t>
+            </w:r>
+            <w:r>
+              <w:rPr>
+                <w:rFonts w:hint="eastAsia" w:eastAsia="宋体"/>
+                <w:lang w:eastAsia="zh-CN"/>
+              </w:rPr>
+              <w:t>○</w:t>
+            </w:r>
+            <w:r>
+              <w:t>]</w:t>
             </w:r>
           </w:p>
         </w:tc>
@@ -2968,7 +3341,17 @@
           </w:tcPr>
           <w:p>
             <w:r>
-              <w:t>[판정 후 기입]</w:t>
+              <w:t>[</w:t>
+            </w:r>
+            <w:r>
+              <w:rPr>
+                <w:rFonts w:hint="eastAsia" w:eastAsia="宋体"/>
+                <w:lang w:eastAsia="zh-CN"/>
+              </w:rPr>
+              <w:t>○</w:t>
+            </w:r>
+            <w:r>
+              <w:t>]</w:t>
             </w:r>
           </w:p>
         </w:tc>
@@ -2978,8 +3361,28 @@
             <w:vAlign w:val="center"/>
           </w:tcPr>
           <w:p>
+            <w:pPr>
+              <w:rPr>
+                <w:rFonts w:hint="eastAsia" w:eastAsia="宋体"/>
+                <w:lang w:eastAsia="zh-CN"/>
+              </w:rPr>
+            </w:pPr>
             <w:r>
-              <w:t>캡처 삽입: Android 동기화 완료 및 게시물 목록 화면</w:t>
+              <w:rPr>
+                <w:rFonts w:hint="eastAsia" w:eastAsia="宋体"/>
+                <w:lang w:eastAsia="zh-CN"/>
+              </w:rPr>
+              <w:pict>
+                <v:shape id="_x0000_i1038" o:spt="75" alt="android_sync" type="#_x0000_t75" style="height:221.95pt;width:105.7pt;" filled="f" o:preferrelative="t" stroked="f" coordsize="21600,21600">
+                  <v:path/>
+                  <v:fill on="f" focussize="0,0"/>
+                  <v:stroke on="f"/>
+                  <v:imagedata r:id="rId20" o:title="android_sync"/>
+                  <o:lock v:ext="edit" aspectratio="t"/>
+                  <w10:wrap type="none"/>
+                  <w10:anchorlock/>
+                </v:shape>
+              </w:pict>
             </w:r>
           </w:p>
         </w:tc>
@@ -3008,7 +3411,6 @@
         <w:tc>
           <w:tcPr>
             <w:tcW w:w="595" w:type="dxa"/>
-            <w:vMerge w:val="restart"/>
             <w:vAlign w:val="center"/>
           </w:tcPr>
           <w:p>
@@ -3032,7 +3434,6 @@
         <w:tc>
           <w:tcPr>
             <w:tcW w:w="603" w:type="dxa"/>
-            <w:vMerge w:val="restart"/>
             <w:vAlign w:val="center"/>
           </w:tcPr>
           <w:p>
@@ -3074,7 +3475,6 @@
         <w:tc>
           <w:tcPr>
             <w:tcW w:w="1382" w:type="dxa"/>
-            <w:vMerge w:val="restart"/>
           </w:tcPr>
           <w:p>
             <w:pPr>
@@ -3193,7 +3593,17 @@
           </w:tcPr>
           <w:p>
             <w:r>
-              <w:t>[실행 후 체크]</w:t>
+              <w:t>[</w:t>
+            </w:r>
+            <w:r>
+              <w:rPr>
+                <w:rFonts w:hint="eastAsia" w:eastAsia="宋体"/>
+                <w:lang w:eastAsia="zh-CN"/>
+              </w:rPr>
+              <w:t>○</w:t>
+            </w:r>
+            <w:r>
+              <w:t>]</w:t>
             </w:r>
           </w:p>
         </w:tc>
@@ -3204,7 +3614,17 @@
           </w:tcPr>
           <w:p>
             <w:r>
-              <w:t>[판정 후 기입]</w:t>
+              <w:t>[</w:t>
+            </w:r>
+            <w:r>
+              <w:rPr>
+                <w:rFonts w:hint="eastAsia" w:eastAsia="宋体"/>
+                <w:lang w:eastAsia="zh-CN"/>
+              </w:rPr>
+              <w:t>○</w:t>
+            </w:r>
+            <w:r>
+              <w:t>]</w:t>
             </w:r>
           </w:p>
         </w:tc>
@@ -3214,195 +3634,31 @@
             <w:vAlign w:val="center"/>
           </w:tcPr>
           <w:p>
-            <w:r>
-              <w:t>선택 구현: Upload (Post에 따른 UI 제공). 캡처 삽입: 게시물 작성/사진 선택/업로드 완료 화면</w:t>
-            </w:r>
-          </w:p>
-        </w:tc>
-      </w:tr>
-      <w:tr>
-        <w:tblPrEx>
-          <w:tblBorders>
-            <w:top w:val="single" w:color="auto" w:sz="4" w:space="0"/>
-            <w:left w:val="single" w:color="auto" w:sz="4" w:space="0"/>
-            <w:bottom w:val="single" w:color="auto" w:sz="4" w:space="0"/>
-            <w:right w:val="single" w:color="auto" w:sz="4" w:space="0"/>
-            <w:insideH w:val="single" w:color="auto" w:sz="4" w:space="0"/>
-            <w:insideV w:val="single" w:color="auto" w:sz="4" w:space="0"/>
-          </w:tblBorders>
-          <w:tblLayout w:type="fixed"/>
-          <w:tblCellMar>
-            <w:top w:w="0" w:type="dxa"/>
-            <w:left w:w="28" w:type="dxa"/>
-            <w:bottom w:w="0" w:type="dxa"/>
-            <w:right w:w="28" w:type="dxa"/>
-          </w:tblCellMar>
-        </w:tblPrEx>
-        <w:trPr>
-          <w:trHeight w:val="40" w:hRule="atLeast"/>
-        </w:trPr>
-        <w:tc>
-          <w:tcPr>
-            <w:tcW w:w="595" w:type="dxa"/>
-            <w:vMerge w:val="continue"/>
-            <w:vAlign w:val="center"/>
-          </w:tcPr>
-          <w:p>
             <w:pPr>
-              <w:jc w:val="center"/>
               <w:rPr>
-                <w:sz w:val="12"/>
-                <w:szCs w:val="12"/>
+                <w:rFonts w:hint="eastAsia" w:eastAsia="宋体"/>
+                <w:lang w:eastAsia="zh-CN"/>
               </w:rPr>
             </w:pPr>
-          </w:p>
-        </w:tc>
-        <w:tc>
-          <w:tcPr>
-            <w:tcW w:w="603" w:type="dxa"/>
-            <w:vMerge w:val="continue"/>
-            <w:vAlign w:val="center"/>
-          </w:tcPr>
-          <w:p>
-            <w:pPr>
-              <w:jc w:val="center"/>
-              <w:rPr>
-                <w:sz w:val="12"/>
-                <w:szCs w:val="12"/>
-              </w:rPr>
-            </w:pPr>
-          </w:p>
-        </w:tc>
-        <w:tc>
-          <w:tcPr>
-            <w:tcW w:w="1382" w:type="dxa"/>
-            <w:vMerge w:val="continue"/>
-          </w:tcPr>
-          <w:p>
-            <w:pPr>
-              <w:jc w:val="left"/>
-              <w:rPr>
-                <w:sz w:val="12"/>
-                <w:szCs w:val="12"/>
-              </w:rPr>
-            </w:pPr>
-          </w:p>
-        </w:tc>
-        <w:tc>
-          <w:tcPr>
-            <w:tcW w:w="3582" w:type="dxa"/>
-          </w:tcPr>
-          <w:p>
-            <w:pPr>
-              <w:rPr>
-                <w:sz w:val="12"/>
-                <w:szCs w:val="12"/>
-              </w:rPr>
-            </w:pPr>
+            <w:bookmarkStart w:id="0" w:name="_GoBack"/>
             <w:r>
               <w:rPr>
-                <w:sz w:val="12"/>
-                <w:szCs w:val="12"/>
+                <w:rFonts w:hint="eastAsia" w:eastAsia="宋体"/>
+                <w:lang w:eastAsia="zh-CN"/>
               </w:rPr>
-              <w:t>MainActivity 클래스 [Upload 구현, 19page]</w:t>
+              <w:pict>
+                <v:shape id="_x0000_i1044" o:spt="75" alt="mainactivity_upload_code" type="#_x0000_t75" style="height:57.4pt;width:105.55pt;" filled="f" o:preferrelative="t" stroked="f" coordsize="21600,21600">
+                  <v:path/>
+                  <v:fill on="f" focussize="0,0"/>
+                  <v:stroke on="f"/>
+                  <v:imagedata r:id="rId21" o:title="mainactivity_upload_code"/>
+                  <o:lock v:ext="edit" aspectratio="t"/>
+                  <w10:wrap type="none"/>
+                  <w10:anchorlock/>
+                </v:shape>
+              </w:pict>
             </w:r>
-          </w:p>
-          <w:p>
-            <w:pPr>
-              <w:rPr>
-                <w:sz w:val="12"/>
-                <w:szCs w:val="12"/>
-              </w:rPr>
-            </w:pPr>
-          </w:p>
-          <w:p>
-            <w:pPr>
-              <w:ind w:firstLine="120" w:firstLineChars="100"/>
-              <w:rPr>
-                <w:sz w:val="12"/>
-                <w:szCs w:val="12"/>
-              </w:rPr>
-            </w:pPr>
-            <w:r>
-              <w:rPr>
-                <w:rFonts w:hint="eastAsia"/>
-                <w:sz w:val="12"/>
-                <w:szCs w:val="12"/>
-              </w:rPr>
-              <w:t xml:space="preserve">2. </w:t>
-            </w:r>
-            <w:r>
-              <w:rPr>
-                <w:sz w:val="12"/>
-                <w:szCs w:val="12"/>
-              </w:rPr>
-              <w:t>Upload (Post에 따른 UI제공) : 상</w:t>
-            </w:r>
-          </w:p>
-          <w:p>
-            <w:pPr>
-              <w:ind w:firstLine="120" w:firstLineChars="100"/>
-              <w:rPr>
-                <w:sz w:val="12"/>
-                <w:szCs w:val="12"/>
-              </w:rPr>
-            </w:pPr>
-            <w:r>
-              <w:rPr>
-                <w:rFonts w:hint="eastAsia"/>
-                <w:sz w:val="12"/>
-                <w:szCs w:val="12"/>
-              </w:rPr>
-              <w:t>(1. 2</w:t>
-            </w:r>
-            <w:r>
-              <w:rPr>
-                <w:sz w:val="12"/>
-                <w:szCs w:val="12"/>
-              </w:rPr>
-              <w:t xml:space="preserve">. </w:t>
-            </w:r>
-            <w:r>
-              <w:rPr>
-                <w:rFonts w:hint="eastAsia"/>
-                <w:sz w:val="12"/>
-                <w:szCs w:val="12"/>
-              </w:rPr>
-              <w:t>중 하나만 제출</w:t>
-            </w:r>
-          </w:p>
-        </w:tc>
-        <w:tc>
-          <w:tcPr>
-            <w:tcW w:w="484" w:type="dxa"/>
-            <w:vAlign w:val="center"/>
-          </w:tcPr>
-          <w:p>
-            <w:r>
-              <w:t>[실행 후 체크]</w:t>
-            </w:r>
-          </w:p>
-        </w:tc>
-        <w:tc>
-          <w:tcPr>
-            <w:tcW w:w="426" w:type="dxa"/>
-            <w:vAlign w:val="center"/>
-          </w:tcPr>
-          <w:p>
-            <w:r>
-              <w:t>[판정 후 기입]</w:t>
-            </w:r>
-          </w:p>
-        </w:tc>
-        <w:tc>
-          <w:tcPr>
-            <w:tcW w:w="2173" w:type="dxa"/>
-            <w:vAlign w:val="center"/>
-          </w:tcPr>
-          <w:p>
-            <w:r>
-              <w:t>캡처 삽입: PythonAnywhere 서버 API 브라우저 화면</w:t>
-            </w:r>
+            <w:bookmarkEnd w:id="0"/>
           </w:p>
         </w:tc>
       </w:tr>
@@ -3539,7 +3795,17 @@
           </w:tcPr>
           <w:p>
             <w:r>
-              <w:t>[실행 후 체크]</w:t>
+              <w:t>[</w:t>
+            </w:r>
+            <w:r>
+              <w:rPr>
+                <w:rFonts w:hint="eastAsia" w:eastAsia="宋体"/>
+                <w:lang w:eastAsia="zh-CN"/>
+              </w:rPr>
+              <w:t>○</w:t>
+            </w:r>
+            <w:r>
+              <w:t>]</w:t>
             </w:r>
           </w:p>
         </w:tc>
@@ -3550,7 +3816,17 @@
           </w:tcPr>
           <w:p>
             <w:r>
-              <w:t>[판정 후 기입]</w:t>
+              <w:t>[</w:t>
+            </w:r>
+            <w:r>
+              <w:rPr>
+                <w:rFonts w:hint="eastAsia" w:eastAsia="宋体"/>
+                <w:lang w:eastAsia="zh-CN"/>
+              </w:rPr>
+              <w:t>○</w:t>
+            </w:r>
+            <w:r>
+              <w:t>]</w:t>
             </w:r>
           </w:p>
         </w:tc>
@@ -3560,8 +3836,28 @@
             <w:vAlign w:val="center"/>
           </w:tcPr>
           <w:p>
+            <w:pPr>
+              <w:rPr>
+                <w:rFonts w:hint="eastAsia" w:eastAsia="宋体"/>
+                <w:lang w:eastAsia="zh-CN"/>
+              </w:rPr>
+            </w:pPr>
             <w:r>
-              <w:t>캡처 삽입: PythonAnywhere 서버와 동기화한 Android 화면</w:t>
+              <w:rPr>
+                <w:rFonts w:hint="eastAsia" w:eastAsia="宋体"/>
+                <w:lang w:eastAsia="zh-CN"/>
+              </w:rPr>
+              <w:pict>
+                <v:shape id="_x0000_i1040" o:spt="75" alt="pythonanywhere_api_posts" type="#_x0000_t75" style="height:40.6pt;width:104.95pt;" filled="f" o:preferrelative="t" stroked="f" coordsize="21600,21600">
+                  <v:path/>
+                  <v:fill on="f" focussize="0,0"/>
+                  <v:stroke on="f"/>
+                  <v:imagedata r:id="rId22" o:title="pythonanywhere_api_posts"/>
+                  <o:lock v:ext="edit" aspectratio="t"/>
+                  <w10:wrap type="none"/>
+                  <w10:anchorlock/>
+                </v:shape>
+              </w:pict>
             </w:r>
           </w:p>
         </w:tc>
@@ -3699,7 +3995,17 @@
           </w:tcPr>
           <w:p>
             <w:r>
-              <w:t>[실행 후 체크]</w:t>
+              <w:t>[</w:t>
+            </w:r>
+            <w:r>
+              <w:rPr>
+                <w:rFonts w:hint="eastAsia" w:eastAsia="宋体"/>
+                <w:lang w:eastAsia="zh-CN"/>
+              </w:rPr>
+              <w:t>○</w:t>
+            </w:r>
+            <w:r>
+              <w:t>]</w:t>
             </w:r>
           </w:p>
         </w:tc>
@@ -3710,7 +4016,17 @@
           </w:tcPr>
           <w:p>
             <w:r>
-              <w:t>[판정 후 기입]</w:t>
+              <w:t>[</w:t>
+            </w:r>
+            <w:r>
+              <w:rPr>
+                <w:rFonts w:hint="eastAsia" w:eastAsia="宋体"/>
+                <w:lang w:eastAsia="zh-CN"/>
+              </w:rPr>
+              <w:t>○</w:t>
+            </w:r>
+            <w:r>
+              <w:t>]</w:t>
             </w:r>
           </w:p>
         </w:tc>
@@ -3720,8 +4036,28 @@
             <w:vAlign w:val="center"/>
           </w:tcPr>
           <w:p>
+            <w:pPr>
+              <w:rPr>
+                <w:rFonts w:hint="eastAsia" w:eastAsia="宋体"/>
+                <w:lang w:eastAsia="zh-CN"/>
+              </w:rPr>
+            </w:pPr>
             <w:r>
-              <w:t>편의 기능 1: 게시물 제목/본문/이미지 업로드. 캡처 삽입: 업로드 완료</w:t>
+              <w:rPr>
+                <w:rFonts w:hint="eastAsia" w:eastAsia="宋体"/>
+                <w:lang w:eastAsia="zh-CN"/>
+              </w:rPr>
+              <w:pict>
+                <v:shape id="_x0000_i1041" o:spt="75" alt="android_cloud_sync" type="#_x0000_t75" style="height:134.75pt;width:105.6pt;" filled="f" o:preferrelative="t" stroked="f" coordsize="21600,21600">
+                  <v:path/>
+                  <v:fill on="f" focussize="0,0"/>
+                  <v:stroke on="f"/>
+                  <v:imagedata r:id="rId23" o:title="android_cloud_sync"/>
+                  <o:lock v:ext="edit" aspectratio="t"/>
+                  <w10:wrap type="none"/>
+                  <w10:anchorlock/>
+                </v:shape>
+              </w:pict>
             </w:r>
           </w:p>
         </w:tc>
@@ -3851,7 +4187,17 @@
           </w:tcPr>
           <w:p>
             <w:r>
-              <w:t>[실행 후 체크]</w:t>
+              <w:t>[</w:t>
+            </w:r>
+            <w:r>
+              <w:rPr>
+                <w:rFonts w:hint="eastAsia" w:eastAsia="宋体"/>
+                <w:lang w:eastAsia="zh-CN"/>
+              </w:rPr>
+              <w:t>○</w:t>
+            </w:r>
+            <w:r>
+              <w:t>]</w:t>
             </w:r>
           </w:p>
         </w:tc>
@@ -3862,7 +4208,17 @@
           </w:tcPr>
           <w:p>
             <w:r>
-              <w:t>[판정 후 기입]</w:t>
+              <w:t>[</w:t>
+            </w:r>
+            <w:r>
+              <w:rPr>
+                <w:rFonts w:hint="eastAsia" w:eastAsia="宋体"/>
+                <w:lang w:eastAsia="zh-CN"/>
+              </w:rPr>
+              <w:t>○</w:t>
+            </w:r>
+            <w:r>
+              <w:t>]</w:t>
             </w:r>
           </w:p>
         </w:tc>
@@ -3872,8 +4228,69 @@
             <w:vAlign w:val="center"/>
           </w:tcPr>
           <w:p>
+            <w:pPr>
+              <w:rPr>
+                <w:rFonts w:hint="eastAsia" w:eastAsia="宋体"/>
+                <w:lang w:eastAsia="zh-CN"/>
+              </w:rPr>
+            </w:pPr>
             <w:r>
-              <w:t>편의 기능 2: 서버 게시물 동기화. 캡처 삽입: 동기화 결과</w:t>
+              <w:rPr>
+                <w:rFonts w:hint="eastAsia" w:eastAsia="宋体"/>
+                <w:lang w:eastAsia="zh-CN"/>
+              </w:rPr>
+              <w:pict>
+                <v:shape id="_x0000_i1042" o:spt="75" alt="convenience_upload" type="#_x0000_t75" style="height:147.65pt;width:105.45pt;" filled="f" o:preferrelative="t" stroked="f" coordsize="21600,21600">
+                  <v:path/>
+                  <v:fill on="f" focussize="0,0"/>
+                  <v:stroke on="f"/>
+                  <v:imagedata r:id="rId24" o:title="convenience_upload"/>
+                  <o:lock v:ext="edit" aspectratio="t"/>
+                  <w10:wrap type="none"/>
+                  <w10:anchorlock/>
+                </v:shape>
+              </w:pict>
+            </w:r>
+          </w:p>
+          <w:p>
+            <w:pPr>
+              <w:rPr>
+                <w:rFonts w:hint="eastAsia" w:eastAsia="宋体"/>
+                <w:lang w:eastAsia="zh-CN"/>
+              </w:rPr>
+            </w:pPr>
+            <w:r>
+              <w:rPr>
+                <w:rFonts w:ascii="宋体" w:hAnsi="宋体" w:eastAsia="宋体" w:cs="宋体"/>
+                <w:sz w:val="24"/>
+                <w:szCs w:val="24"/>
+              </w:rPr>
+              <w:t>편의 기능: 사진 선택 및 게시물 업로드 기능을 제공하여 사용자가 이미지가 포함된 게시물을 쉽게 작성하고 서버에 업로드할 수 있다.</w:t>
+            </w:r>
+          </w:p>
+          <w:p>
+            <w:pPr>
+              <w:rPr>
+                <w:rFonts w:hint="eastAsia" w:eastAsia="宋体"/>
+                <w:lang w:eastAsia="zh-CN"/>
+              </w:rPr>
+            </w:pPr>
+            <w:r>
+              <w:rPr>
+                <w:rFonts w:hint="eastAsia" w:eastAsia="宋体"/>
+                <w:lang w:eastAsia="zh-CN"/>
+              </w:rPr>
+              <w:pict>
+                <v:shape id="_x0000_i1043" o:spt="75" alt="post_create" type="#_x0000_t75" style="height:50.3pt;width:105.8pt;" filled="f" o:preferrelative="t" stroked="f" coordsize="21600,21600">
+                  <v:path/>
+                  <v:fill on="f" focussize="0,0"/>
+                  <v:stroke on="f"/>
+                  <v:imagedata r:id="rId9" o:title="post_create"/>
+                  <o:lock v:ext="edit" aspectratio="t"/>
+                  <w10:wrap type="none"/>
+                  <w10:anchorlock/>
+                </v:shape>
+              </w:pict>
             </w:r>
           </w:p>
         </w:tc>
@@ -4401,17 +4818,6 @@
         <w:rPr>
           <w:b/>
         </w:rPr>
-        <w:t xml:space="preserve">보고서 작성 안내: </w:t>
-      </w:r>
-      <w:r>
-        <w:t>각 [캡처 삽입: ...] 항목을 실제 실행 화면으로 교체하고, 이미지가 문서에 포함되었는지 확인하세요. 아직 수행하지 않은 항목은 완료/적합으로 표시하지 마세요.</w:t>
-      </w:r>
-    </w:p>
-    <w:p>
-      <w:r>
-        <w:rPr>
-          <w:b/>
-        </w:rPr>
         <w:t xml:space="preserve">GitHub 저장소: </w:t>
       </w:r>
       <w:r>
@@ -12910,7 +13316,7 @@
   <w:docDefaults>
     <w:rPrDefault>
       <w:rPr>
-        <w:rFonts w:ascii="BatangChe" w:hAnsi="BatangChe" w:eastAsia="BatangChe" w:cs="Gulim"/>
+        <w:rFonts w:ascii="Times New Roman" w:hAnsi="Times New Roman" w:eastAsia="宋体" w:cs="Times New Roman"/>
       </w:rPr>
     </w:rPrDefault>
   </w:docDefaults>
@@ -12925,58 +13331,58 @@
     <w:lsdException w:qFormat="1" w:unhideWhenUsed="0" w:uiPriority="0" w:semiHidden="0" w:name="heading 7"/>
     <w:lsdException w:qFormat="1" w:unhideWhenUsed="0" w:uiPriority="0" w:semiHidden="0" w:name="heading 8"/>
     <w:lsdException w:qFormat="1" w:unhideWhenUsed="0" w:uiPriority="0" w:semiHidden="0" w:name="heading 9"/>
-    <w:lsdException w:unhideWhenUsed="0" w:uiPriority="0" w:semiHidden="0" w:name="index 1"/>
+    <w:lsdException w:qFormat="1" w:unhideWhenUsed="0" w:uiPriority="0" w:semiHidden="0" w:name="index 1"/>
     <w:lsdException w:unhideWhenUsed="0" w:uiPriority="0" w:semiHidden="0" w:name="index 2"/>
     <w:lsdException w:unhideWhenUsed="0" w:uiPriority="0" w:semiHidden="0" w:name="index 3"/>
     <w:lsdException w:unhideWhenUsed="0" w:uiPriority="0" w:semiHidden="0" w:name="index 4"/>
     <w:lsdException w:unhideWhenUsed="0" w:uiPriority="0" w:semiHidden="0" w:name="index 5"/>
-    <w:lsdException w:unhideWhenUsed="0" w:uiPriority="0" w:semiHidden="0" w:name="index 6"/>
+    <w:lsdException w:qFormat="1" w:unhideWhenUsed="0" w:uiPriority="0" w:semiHidden="0" w:name="index 6"/>
     <w:lsdException w:unhideWhenUsed="0" w:uiPriority="0" w:semiHidden="0" w:name="index 7"/>
     <w:lsdException w:unhideWhenUsed="0" w:uiPriority="0" w:semiHidden="0" w:name="index 8"/>
     <w:lsdException w:unhideWhenUsed="0" w:uiPriority="0" w:semiHidden="0" w:name="index 9"/>
     <w:lsdException w:qFormat="1" w:unhideWhenUsed="0" w:uiPriority="0" w:semiHidden="0" w:name="toc 1"/>
     <w:lsdException w:qFormat="1" w:unhideWhenUsed="0" w:uiPriority="0" w:semiHidden="0" w:name="toc 2"/>
     <w:lsdException w:qFormat="1" w:unhideWhenUsed="0" w:uiPriority="0" w:semiHidden="0" w:name="toc 3"/>
-    <w:lsdException w:unhideWhenUsed="0" w:uiPriority="0" w:semiHidden="0" w:name="toc 4"/>
-    <w:lsdException w:unhideWhenUsed="0" w:uiPriority="0" w:semiHidden="0" w:name="toc 5"/>
-    <w:lsdException w:unhideWhenUsed="0" w:uiPriority="0" w:semiHidden="0" w:name="toc 6"/>
-    <w:lsdException w:unhideWhenUsed="0" w:uiPriority="0" w:semiHidden="0" w:name="toc 7"/>
-    <w:lsdException w:unhideWhenUsed="0" w:uiPriority="0" w:semiHidden="0" w:name="toc 8"/>
-    <w:lsdException w:unhideWhenUsed="0" w:uiPriority="0" w:semiHidden="0" w:name="toc 9"/>
+    <w:lsdException w:qFormat="1" w:unhideWhenUsed="0" w:uiPriority="0" w:semiHidden="0" w:name="toc 4"/>
+    <w:lsdException w:qFormat="1" w:unhideWhenUsed="0" w:uiPriority="0" w:semiHidden="0" w:name="toc 5"/>
+    <w:lsdException w:qFormat="1" w:unhideWhenUsed="0" w:uiPriority="0" w:semiHidden="0" w:name="toc 6"/>
+    <w:lsdException w:qFormat="1" w:unhideWhenUsed="0" w:uiPriority="0" w:semiHidden="0" w:name="toc 7"/>
+    <w:lsdException w:qFormat="1" w:unhideWhenUsed="0" w:uiPriority="0" w:semiHidden="0" w:name="toc 8"/>
+    <w:lsdException w:qFormat="1" w:unhideWhenUsed="0" w:uiPriority="0" w:semiHidden="0" w:name="toc 9"/>
     <w:lsdException w:qFormat="1" w:unhideWhenUsed="0" w:uiPriority="0" w:semiHidden="0" w:name="Normal Indent"/>
-    <w:lsdException w:unhideWhenUsed="0" w:uiPriority="0" w:semiHidden="0" w:name="footnote text"/>
-    <w:lsdException w:unhideWhenUsed="0" w:uiPriority="0" w:semiHidden="0" w:name="annotation text"/>
+    <w:lsdException w:qFormat="1" w:unhideWhenUsed="0" w:uiPriority="0" w:semiHidden="0" w:name="footnote text"/>
+    <w:lsdException w:qFormat="1" w:unhideWhenUsed="0" w:uiPriority="0" w:semiHidden="0" w:name="annotation text"/>
     <w:lsdException w:qFormat="1" w:unhideWhenUsed="0" w:uiPriority="0" w:semiHidden="0" w:name="header"/>
     <w:lsdException w:qFormat="1" w:unhideWhenUsed="0" w:uiPriority="99" w:semiHidden="0" w:name="footer"/>
     <w:lsdException w:qFormat="1" w:unhideWhenUsed="0" w:uiPriority="0" w:semiHidden="0" w:name="index heading"/>
     <w:lsdException w:qFormat="1" w:unhideWhenUsed="0" w:uiPriority="0" w:semiHidden="0" w:name="caption"/>
-    <w:lsdException w:unhideWhenUsed="0" w:uiPriority="0" w:semiHidden="0" w:name="table of figures"/>
+    <w:lsdException w:qFormat="1" w:unhideWhenUsed="0" w:uiPriority="0" w:semiHidden="0" w:name="table of figures"/>
     <w:lsdException w:unhideWhenUsed="0" w:uiPriority="0" w:semiHidden="0" w:name="envelope address"/>
     <w:lsdException w:unhideWhenUsed="0" w:uiPriority="0" w:semiHidden="0" w:name="envelope return"/>
     <w:lsdException w:qFormat="1" w:unhideWhenUsed="0" w:uiPriority="0" w:semiHidden="0" w:name="footnote reference"/>
-    <w:lsdException w:unhideWhenUsed="0" w:uiPriority="0" w:semiHidden="0" w:name="annotation reference"/>
+    <w:lsdException w:qFormat="1" w:unhideWhenUsed="0" w:uiPriority="0" w:semiHidden="0" w:name="annotation reference"/>
     <w:lsdException w:qFormat="1" w:unhideWhenUsed="0" w:uiPriority="0" w:semiHidden="0" w:name="line number"/>
     <w:lsdException w:qFormat="1" w:unhideWhenUsed="0" w:uiPriority="0" w:semiHidden="0" w:name="page number"/>
     <w:lsdException w:qFormat="1" w:unhideWhenUsed="0" w:uiPriority="0" w:semiHidden="0" w:name="endnote reference"/>
-    <w:lsdException w:unhideWhenUsed="0" w:uiPriority="0" w:semiHidden="0" w:name="endnote text"/>
+    <w:lsdException w:qFormat="1" w:unhideWhenUsed="0" w:uiPriority="0" w:semiHidden="0" w:name="endnote text"/>
     <w:lsdException w:unhideWhenUsed="0" w:uiPriority="0" w:semiHidden="0" w:name="table of authorities"/>
     <w:lsdException w:unhideWhenUsed="0" w:uiPriority="0" w:semiHidden="0" w:name="macro"/>
     <w:lsdException w:unhideWhenUsed="0" w:uiPriority="0" w:semiHidden="0" w:name="toa heading"/>
-    <w:lsdException w:unhideWhenUsed="0" w:uiPriority="0" w:semiHidden="0" w:name="List"/>
+    <w:lsdException w:qFormat="1" w:unhideWhenUsed="0" w:uiPriority="0" w:semiHidden="0" w:name="List"/>
     <w:lsdException w:qFormat="1" w:unhideWhenUsed="0" w:uiPriority="0" w:semiHidden="0" w:name="List Bullet"/>
-    <w:lsdException w:unhideWhenUsed="0" w:uiPriority="0" w:semiHidden="0" w:name="List Number"/>
-    <w:lsdException w:unhideWhenUsed="0" w:uiPriority="0" w:semiHidden="0" w:name="List 2"/>
+    <w:lsdException w:qFormat="1" w:unhideWhenUsed="0" w:uiPriority="0" w:semiHidden="0" w:name="List Number"/>
+    <w:lsdException w:qFormat="1" w:unhideWhenUsed="0" w:uiPriority="0" w:semiHidden="0" w:name="List 2"/>
     <w:lsdException w:unhideWhenUsed="0" w:uiPriority="0" w:semiHidden="0" w:name="List 3"/>
     <w:lsdException w:qFormat="1" w:unhideWhenUsed="0" w:uiPriority="0" w:semiHidden="0" w:name="List 4"/>
     <w:lsdException w:unhideWhenUsed="0" w:uiPriority="0" w:semiHidden="0" w:name="List 5"/>
-    <w:lsdException w:unhideWhenUsed="0" w:uiPriority="0" w:semiHidden="0" w:name="List Bullet 2"/>
+    <w:lsdException w:qFormat="1" w:unhideWhenUsed="0" w:uiPriority="0" w:semiHidden="0" w:name="List Bullet 2"/>
     <w:lsdException w:qFormat="1" w:unhideWhenUsed="0" w:uiPriority="0" w:semiHidden="0" w:name="List Bullet 3"/>
-    <w:lsdException w:unhideWhenUsed="0" w:uiPriority="0" w:semiHidden="0" w:name="List Bullet 4"/>
-    <w:lsdException w:unhideWhenUsed="0" w:uiPriority="0" w:semiHidden="0" w:name="List Bullet 5"/>
-    <w:lsdException w:unhideWhenUsed="0" w:uiPriority="0" w:semiHidden="0" w:name="List Number 2"/>
-    <w:lsdException w:unhideWhenUsed="0" w:uiPriority="0" w:semiHidden="0" w:name="List Number 3"/>
-    <w:lsdException w:unhideWhenUsed="0" w:uiPriority="0" w:semiHidden="0" w:name="List Number 4"/>
-    <w:lsdException w:unhideWhenUsed="0" w:uiPriority="0" w:semiHidden="0" w:name="List Number 5"/>
+    <w:lsdException w:qFormat="1" w:unhideWhenUsed="0" w:uiPriority="0" w:semiHidden="0" w:name="List Bullet 4"/>
+    <w:lsdException w:qFormat="1" w:unhideWhenUsed="0" w:uiPriority="0" w:semiHidden="0" w:name="List Bullet 5"/>
+    <w:lsdException w:qFormat="1" w:unhideWhenUsed="0" w:uiPriority="0" w:semiHidden="0" w:name="List Number 2"/>
+    <w:lsdException w:qFormat="1" w:unhideWhenUsed="0" w:uiPriority="0" w:semiHidden="0" w:name="List Number 3"/>
+    <w:lsdException w:qFormat="1" w:unhideWhenUsed="0" w:uiPriority="0" w:semiHidden="0" w:name="List Number 4"/>
+    <w:lsdException w:qFormat="1" w:unhideWhenUsed="0" w:uiPriority="0" w:semiHidden="0" w:name="List Number 5"/>
     <w:lsdException w:qFormat="1" w:unhideWhenUsed="0" w:uiPriority="0" w:semiHidden="0" w:name="Title"/>
     <w:lsdException w:unhideWhenUsed="0" w:uiPriority="0" w:semiHidden="0" w:name="Closing"/>
     <w:lsdException w:unhideWhenUsed="0" w:uiPriority="0" w:semiHidden="0" w:name="Signature"/>
@@ -12993,19 +13399,19 @@
     <w:lsdException w:unhideWhenUsed="0" w:uiPriority="0" w:semiHidden="0" w:name="Salutation"/>
     <w:lsdException w:qFormat="1" w:unhideWhenUsed="0" w:uiPriority="0" w:semiHidden="0" w:name="Date"/>
     <w:lsdException w:qFormat="1" w:unhideWhenUsed="0" w:uiPriority="0" w:semiHidden="0" w:name="Body Text First Indent"/>
-    <w:lsdException w:unhideWhenUsed="0" w:uiPriority="0" w:semiHidden="0" w:name="Body Text First Indent 2"/>
-    <w:lsdException w:uiPriority="0" w:semiHidden="0" w:name="Note Heading"/>
+    <w:lsdException w:qFormat="1" w:unhideWhenUsed="0" w:uiPriority="0" w:semiHidden="0" w:name="Body Text First Indent 2"/>
+    <w:lsdException w:qFormat="1" w:uiPriority="0" w:semiHidden="0" w:name="Note Heading"/>
     <w:lsdException w:qFormat="1" w:unhideWhenUsed="0" w:uiPriority="0" w:semiHidden="0" w:name="Body Text 2"/>
     <w:lsdException w:qFormat="1" w:unhideWhenUsed="0" w:uiPriority="0" w:semiHidden="0" w:name="Body Text 3"/>
     <w:lsdException w:qFormat="1" w:unhideWhenUsed="0" w:uiPriority="0" w:semiHidden="0" w:name="Body Text Indent 2"/>
     <w:lsdException w:unhideWhenUsed="0" w:uiPriority="0" w:semiHidden="0" w:name="Body Text Indent 3"/>
-    <w:lsdException w:unhideWhenUsed="0" w:uiPriority="0" w:semiHidden="0" w:name="Block Text"/>
+    <w:lsdException w:qFormat="1" w:unhideWhenUsed="0" w:uiPriority="0" w:semiHidden="0" w:name="Block Text"/>
     <w:lsdException w:qFormat="1" w:unhideWhenUsed="0" w:uiPriority="0" w:semiHidden="0" w:name="Hyperlink"/>
     <w:lsdException w:qFormat="1" w:unhideWhenUsed="0" w:uiPriority="0" w:semiHidden="0" w:name="FollowedHyperlink"/>
     <w:lsdException w:qFormat="1" w:unhideWhenUsed="0" w:uiPriority="0" w:semiHidden="0" w:name="Strong"/>
     <w:lsdException w:qFormat="1" w:unhideWhenUsed="0" w:uiPriority="20" w:semiHidden="0" w:name="Emphasis"/>
     <w:lsdException w:qFormat="1" w:unhideWhenUsed="0" w:uiPriority="0" w:semiHidden="0" w:name="Document Map"/>
-    <w:lsdException w:unhideWhenUsed="0" w:uiPriority="0" w:semiHidden="0" w:name="Plain Text"/>
+    <w:lsdException w:qFormat="1" w:unhideWhenUsed="0" w:uiPriority="0" w:semiHidden="0" w:name="Plain Text"/>
     <w:lsdException w:unhideWhenUsed="0" w:uiPriority="0" w:semiHidden="0" w:name="E-mail Signature"/>
     <w:lsdException w:qFormat="1" w:unhideWhenUsed="0" w:uiPriority="0" w:semiHidden="0" w:name="Normal (Web)"/>
     <w:lsdException w:unhideWhenUsed="0" w:uiPriority="0" w:semiHidden="0" w:name="HTML Acronym"/>
@@ -13019,7 +13425,7 @@
     <w:lsdException w:unhideWhenUsed="0" w:uiPriority="0" w:semiHidden="0" w:name="HTML Typewriter"/>
     <w:lsdException w:unhideWhenUsed="0" w:uiPriority="0" w:semiHidden="0" w:name="HTML Variable"/>
     <w:lsdException w:qFormat="1" w:uiPriority="99" w:name="Normal Table"/>
-    <w:lsdException w:unhideWhenUsed="0" w:uiPriority="0" w:semiHidden="0" w:name="annotation subject"/>
+    <w:lsdException w:qFormat="1" w:unhideWhenUsed="0" w:uiPriority="0" w:semiHidden="0" w:name="annotation subject"/>
     <w:lsdException w:uiPriority="0" w:name="Table Simple 1"/>
     <w:lsdException w:uiPriority="0" w:name="Table Simple 2"/>
     <w:lsdException w:uiPriority="0" w:name="Table Simple 3"/>
@@ -13064,7 +13470,7 @@
     <w:lsdException w:uiPriority="0" w:name="Table Web 3"/>
     <w:lsdException w:qFormat="1" w:unhideWhenUsed="0" w:uiPriority="0" w:semiHidden="0" w:name="Balloon Text"/>
     <w:lsdException w:qFormat="1" w:unhideWhenUsed="0" w:uiPriority="0" w:semiHidden="0" w:name="Table Grid"/>
-    <w:lsdException w:unhideWhenUsed="0" w:uiPriority="0" w:semiHidden="0" w:name="Table Theme"/>
+    <w:lsdException w:qFormat="1" w:unhideWhenUsed="0" w:uiPriority="0" w:semiHidden="0" w:name="Table Theme"/>
     <w:lsdException w:unhideWhenUsed="0" w:uiPriority="99" w:name="Placeholder Text"/>
     <w:lsdException w:qFormat="1" w:unhideWhenUsed="0" w:uiPriority="1" w:semiHidden="0" w:name="No Spacing"/>
     <w:lsdException w:unhideWhenUsed="0" w:uiPriority="60" w:semiHidden="0" w:name="Light Shading"/>
@@ -13395,6 +13801,7 @@
     <w:name w:val="toc 7"/>
     <w:basedOn w:val="1"/>
     <w:next w:val="1"/>
+    <w:qFormat/>
     <w:uiPriority w:val="0"/>
     <w:pPr>
       <w:autoSpaceDE w:val="0"/>
@@ -13410,6 +13817,7 @@
   <w:style w:type="paragraph" w:styleId="12">
     <w:name w:val="List Number 2"/>
     <w:basedOn w:val="1"/>
+    <w:qFormat/>
     <w:uiPriority w:val="0"/>
     <w:rPr>
       <w:sz w:val="20"/>
@@ -13421,6 +13829,7 @@
     <w:next w:val="1"/>
     <w:link w:val="905"/>
     <w:unhideWhenUsed/>
+    <w:qFormat/>
     <w:uiPriority w:val="0"/>
     <w:pPr>
       <w:jc w:val="center"/>
@@ -13436,6 +13845,7 @@
     <w:name w:val="List Bullet 4"/>
     <w:basedOn w:val="1"/>
     <w:next w:val="15"/>
+    <w:qFormat/>
     <w:uiPriority w:val="0"/>
     <w:pPr>
       <w:tabs>
@@ -13453,6 +13863,7 @@
   <w:style w:type="paragraph" w:styleId="15">
     <w:name w:val="List Bullet 5"/>
     <w:basedOn w:val="1"/>
+    <w:qFormat/>
     <w:uiPriority w:val="0"/>
     <w:pPr>
       <w:tabs>
@@ -13470,6 +13881,7 @@
   <w:style w:type="paragraph" w:styleId="16">
     <w:name w:val="List Number"/>
     <w:basedOn w:val="1"/>
+    <w:qFormat/>
     <w:uiPriority w:val="0"/>
     <w:pPr>
       <w:widowControl/>
@@ -13618,6 +14030,7 @@
     <w:name w:val="annotation text"/>
     <w:basedOn w:val="1"/>
     <w:link w:val="896"/>
+    <w:qFormat/>
     <w:uiPriority w:val="0"/>
     <w:pPr>
       <w:widowControl/>
@@ -13639,6 +14052,7 @@
     <w:name w:val="index 6"/>
     <w:basedOn w:val="1"/>
     <w:next w:val="1"/>
+    <w:qFormat/>
     <w:uiPriority w:val="0"/>
     <w:pPr>
       <w:widowControl/>
@@ -13715,6 +14129,7 @@
   <w:style w:type="paragraph" w:styleId="27">
     <w:name w:val="List Number 3"/>
     <w:basedOn w:val="1"/>
+    <w:qFormat/>
     <w:uiPriority w:val="0"/>
     <w:pPr>
       <w:widowControl/>
@@ -13736,6 +14151,7 @@
   <w:style w:type="paragraph" w:styleId="28">
     <w:name w:val="List 2"/>
     <w:basedOn w:val="1"/>
+    <w:qFormat/>
     <w:uiPriority w:val="0"/>
     <w:pPr>
       <w:tabs>
@@ -13751,6 +14167,7 @@
   <w:style w:type="paragraph" w:styleId="29">
     <w:name w:val="Block Text"/>
     <w:basedOn w:val="1"/>
+    <w:qFormat/>
     <w:uiPriority w:val="0"/>
     <w:pPr>
       <w:autoSpaceDE w:val="0"/>
@@ -13765,6 +14182,7 @@
   <w:style w:type="paragraph" w:styleId="30">
     <w:name w:val="List Bullet 2"/>
     <w:basedOn w:val="1"/>
+    <w:qFormat/>
     <w:uiPriority w:val="0"/>
     <w:pPr>
       <w:tabs>
@@ -13786,6 +14204,7 @@
     <w:name w:val="toc 5"/>
     <w:basedOn w:val="1"/>
     <w:next w:val="1"/>
+    <w:qFormat/>
     <w:uiPriority w:val="0"/>
     <w:pPr>
       <w:widowControl/>
@@ -13817,6 +14236,7 @@
     <w:name w:val="Plain Text"/>
     <w:basedOn w:val="1"/>
     <w:link w:val="289"/>
+    <w:qFormat/>
     <w:uiPriority w:val="0"/>
     <w:pPr>
       <w:tabs>
@@ -13870,6 +14290,7 @@
   <w:style w:type="paragraph" w:styleId="34">
     <w:name w:val="List Number 4"/>
     <w:basedOn w:val="1"/>
+    <w:qFormat/>
     <w:uiPriority w:val="0"/>
     <w:pPr>
       <w:tabs>
@@ -13891,6 +14312,7 @@
     <w:name w:val="toc 8"/>
     <w:basedOn w:val="1"/>
     <w:next w:val="1"/>
+    <w:qFormat/>
     <w:uiPriority w:val="0"/>
     <w:pPr>
       <w:widowControl/>
@@ -13931,6 +14353,7 @@
     <w:name w:val="endnote text"/>
     <w:basedOn w:val="1"/>
     <w:link w:val="898"/>
+    <w:qFormat/>
     <w:uiPriority w:val="0"/>
     <w:pPr>
       <w:snapToGrid w:val="0"/>
@@ -14012,6 +14435,7 @@
     <w:name w:val="toc 4"/>
     <w:basedOn w:val="1"/>
     <w:next w:val="1"/>
+    <w:qFormat/>
     <w:uiPriority w:val="0"/>
     <w:pPr>
       <w:spacing w:line="240" w:lineRule="atLeast"/>
@@ -14059,6 +14483,7 @@
   <w:style w:type="paragraph" w:styleId="46">
     <w:name w:val="List Number 5"/>
     <w:basedOn w:val="1"/>
+    <w:qFormat/>
     <w:uiPriority w:val="0"/>
     <w:pPr>
       <w:tabs>
@@ -14079,6 +14504,7 @@
   <w:style w:type="paragraph" w:styleId="47">
     <w:name w:val="List"/>
     <w:basedOn w:val="1"/>
+    <w:qFormat/>
     <w:uiPriority w:val="0"/>
     <w:pPr>
       <w:adjustRightInd w:val="0"/>
@@ -14095,6 +14521,7 @@
     <w:name w:val="footnote text"/>
     <w:basedOn w:val="1"/>
     <w:link w:val="303"/>
+    <w:qFormat/>
     <w:uiPriority w:val="0"/>
     <w:pPr>
       <w:snapToGrid w:val="0"/>
@@ -14110,6 +14537,7 @@
     <w:name w:val="toc 6"/>
     <w:basedOn w:val="1"/>
     <w:next w:val="1"/>
+    <w:qFormat/>
     <w:uiPriority w:val="0"/>
     <w:pPr>
       <w:widowControl/>
@@ -14124,6 +14552,7 @@
     <w:name w:val="table of figures"/>
     <w:basedOn w:val="1"/>
     <w:next w:val="1"/>
+    <w:qFormat/>
     <w:uiPriority w:val="0"/>
     <w:pPr>
       <w:widowControl/>
@@ -14164,6 +14593,7 @@
     <w:name w:val="toc 9"/>
     <w:basedOn w:val="1"/>
     <w:next w:val="1"/>
+    <w:qFormat/>
     <w:uiPriority w:val="0"/>
     <w:pPr>
       <w:widowControl/>
@@ -14256,6 +14686,7 @@
     <w:name w:val="index 1"/>
     <w:basedOn w:val="1"/>
     <w:next w:val="1"/>
+    <w:qFormat/>
     <w:uiPriority w:val="0"/>
     <w:pPr>
       <w:ind w:left="200" w:leftChars="200" w:hanging="2000" w:hangingChars="200"/>
@@ -14289,6 +14720,7 @@
     <w:basedOn w:val="22"/>
     <w:next w:val="22"/>
     <w:link w:val="909"/>
+    <w:qFormat/>
     <w:uiPriority w:val="0"/>
     <w:pPr>
       <w:widowControl w:val="0"/>
@@ -14324,6 +14756,7 @@
     <w:name w:val="Body Text First Indent 2"/>
     <w:basedOn w:val="26"/>
     <w:link w:val="904"/>
+    <w:qFormat/>
     <w:uiPriority w:val="0"/>
     <w:pPr>
       <w:ind w:left="0" w:leftChars="0" w:firstLine="210"/>
@@ -14358,6 +14791,7 @@
   <w:style w:type="table" w:styleId="64">
     <w:name w:val="Table Theme"/>
     <w:basedOn w:val="62"/>
+    <w:qFormat/>
     <w:uiPriority w:val="0"/>
     <w:pPr>
       <w:widowControl w:val="0"/>
@@ -14437,6 +14871,7 @@
   </w:style>
   <w:style w:type="character" w:styleId="73">
     <w:name w:val="annotation reference"/>
+    <w:qFormat/>
     <w:uiPriority w:val="0"/>
     <w:rPr>
       <w:sz w:val="18"/>
@@ -14493,6 +14928,7 @@
   <w:style w:type="paragraph" w:customStyle="1" w:styleId="78">
     <w:name w:val="표제목"/>
     <w:basedOn w:val="1"/>
+    <w:qFormat/>
     <w:uiPriority w:val="0"/>
     <w:pPr>
       <w:jc w:val="center"/>
@@ -28948,6 +29384,7 @@
   <w:style w:type="paragraph" w:customStyle="1" w:styleId="859">
     <w:name w:val="B1"/>
     <w:basedOn w:val="1"/>
+    <w:qFormat/>
     <w:uiPriority w:val="0"/>
     <w:pPr>
       <w:adjustRightInd w:val="0"/>

</xml_diff>